<commit_message>
docs(dev): cut the seminar report from 23 pages to 18
Second pass. 12 pages of content, down from 17.

- Merged sections 3.2/3.3 and compressed the literature and limitations
  chapters; dropped the Random Forest diagram and the model-info screenshot.
- Scaled the remaining images down so they share pages with text rather
  than each taking one.
- Fixed two layout bugs that each stranded a near-empty page: table() always
  appended a spacer paragraph, which landed alone on a new page when the
  table ended a chapter, and a long table marked cantSplit was pushed whole
  onto the next page. chapter() now drops trailing empties, and table()
  takes split= for tables allowed to break.

Every page now carries 147-308 words. No blank pages, and all 21 index,
figure and table page numbers verified against the rendered PDF.

Co-Authored-By: Claude Opus 5 <noreply@anthropic.com>
</commit_message>
<xml_diff>
--- a/dev/report/Seminar_Report_Loan_Default_Prediction.docx
+++ b/dev/report/Seminar_Report_Loan_Default_Prediction.docx
@@ -641,13 +641,6 @@
         <w:t>INDEX</w:t>
       </w:r>
     </w:p>
-    <w:p>
-      <w:pPr>
-        <w:keepNext/>
-        <w:spacing w:before="160" w:after="60" w:line="240" w:lineRule="auto"/>
-        <w:jc w:val="center"/>
-      </w:pPr>
-    </w:p>
     <w:tbl>
       <w:tblPr>
         <w:tblStyle w:val="TableGrid"/>
@@ -1179,7 +1172,7 @@
                 <w:color w:val="000000"/>
                 <w:sz w:val="22"/>
               </w:rPr>
-              <w:t>4</w:t>
+              <w:t>3</w:t>
             </w:r>
           </w:p>
         </w:tc>
@@ -1253,7 +1246,7 @@
                 <w:color w:val="000000"/>
                 <w:sz w:val="22"/>
               </w:rPr>
-              <w:t>8</w:t>
+              <w:t>6</w:t>
             </w:r>
           </w:p>
         </w:tc>
@@ -1327,7 +1320,7 @@
                 <w:color w:val="000000"/>
                 <w:sz w:val="22"/>
               </w:rPr>
-              <w:t>13</w:t>
+              <w:t>9</w:t>
             </w:r>
           </w:p>
         </w:tc>
@@ -1401,7 +1394,7 @@
                 <w:color w:val="000000"/>
                 <w:sz w:val="22"/>
               </w:rPr>
-              <w:t>15</w:t>
+              <w:t>10</w:t>
             </w:r>
           </w:p>
         </w:tc>
@@ -1475,7 +1468,7 @@
                 <w:color w:val="000000"/>
                 <w:sz w:val="22"/>
               </w:rPr>
-              <w:t>16</w:t>
+              <w:t>11</w:t>
             </w:r>
           </w:p>
         </w:tc>
@@ -1546,18 +1539,12 @@
                 <w:color w:val="000000"/>
                 <w:sz w:val="22"/>
               </w:rPr>
-              <w:t>17</w:t>
+              <w:t>12</w:t>
             </w:r>
           </w:p>
         </w:tc>
       </w:tr>
     </w:tbl>
-    <w:p>
-      <w:pPr>
-        <w:spacing w:before="0" w:after="80" w:line="360" w:lineRule="auto"/>
-        <w:jc w:val="both"/>
-      </w:pPr>
-    </w:p>
     <w:p>
       <w:pPr>
         <w:pageBreakBefore/>
@@ -1743,81 +1730,7 @@
                 <w:color w:val="000000"/>
                 <w:sz w:val="22"/>
               </w:rPr>
-              <w:t>4</w:t>
-            </w:r>
-          </w:p>
-        </w:tc>
-      </w:tr>
-      <w:tr>
-        <w:trPr>
-          <w:cantSplit/>
-        </w:trPr>
-        <w:tc>
-          <w:tcPr>
-            <w:tcW w:type="dxa" w:w="1296"/>
-          </w:tcPr>
-          <w:p>
-            <w:pPr>
-              <w:keepNext/>
-              <w:spacing w:line="240" w:lineRule="auto" w:after="40"/>
-              <w:jc w:val="left"/>
-            </w:pPr>
-            <w:r/>
-            <w:r>
-              <w:rPr>
-                <w:rFonts w:ascii="Times New Roman" w:hAnsi="Times New Roman" w:eastAsia="Times New Roman"/>
-                <w:b w:val="0"/>
-                <w:i w:val="0"/>
-                <w:color w:val="000000"/>
-                <w:sz w:val="22"/>
-              </w:rPr>
-              <w:t>Fig. 3.2</w:t>
-            </w:r>
-          </w:p>
-        </w:tc>
-        <w:tc>
-          <w:tcPr>
-            <w:tcW w:type="dxa" w:w="5616"/>
-          </w:tcPr>
-          <w:p>
-            <w:pPr>
-              <w:keepNext/>
-              <w:spacing w:line="240" w:lineRule="auto" w:after="40"/>
-              <w:jc w:val="center"/>
-            </w:pPr>
-            <w:r/>
-            <w:r>
-              <w:rPr>
-                <w:rFonts w:ascii="Times New Roman" w:hAnsi="Times New Roman" w:eastAsia="Times New Roman"/>
-                <w:b w:val="0"/>
-                <w:i w:val="0"/>
-                <w:color w:val="000000"/>
-                <w:sz w:val="22"/>
-              </w:rPr>
-              <w:t>How a Random Forest produces a prediction</w:t>
-            </w:r>
-          </w:p>
-        </w:tc>
-        <w:tc>
-          <w:tcPr>
-            <w:tcW w:type="dxa" w:w="1296"/>
-          </w:tcPr>
-          <w:p>
-            <w:pPr>
-              <w:keepNext/>
-              <w:spacing w:line="240" w:lineRule="auto" w:after="40"/>
-              <w:jc w:val="center"/>
-            </w:pPr>
-            <w:r/>
-            <w:r>
-              <w:rPr>
-                <w:rFonts w:ascii="Times New Roman" w:hAnsi="Times New Roman" w:eastAsia="Times New Roman"/>
-                <w:b w:val="0"/>
-                <w:i w:val="0"/>
-                <w:color w:val="000000"/>
-                <w:sz w:val="22"/>
-              </w:rPr>
-              <w:t>5</w:t>
+              <w:t>3</w:t>
             </w:r>
           </w:p>
         </w:tc>
@@ -1891,81 +1804,7 @@
                 <w:color w:val="000000"/>
                 <w:sz w:val="22"/>
               </w:rPr>
-              <w:t>9</w:t>
-            </w:r>
-          </w:p>
-        </w:tc>
-      </w:tr>
-      <w:tr>
-        <w:trPr>
-          <w:cantSplit/>
-        </w:trPr>
-        <w:tc>
-          <w:tcPr>
-            <w:tcW w:type="dxa" w:w="1296"/>
-          </w:tcPr>
-          <w:p>
-            <w:pPr>
-              <w:keepNext/>
-              <w:spacing w:line="240" w:lineRule="auto" w:after="40"/>
-              <w:jc w:val="left"/>
-            </w:pPr>
-            <w:r/>
-            <w:r>
-              <w:rPr>
-                <w:rFonts w:ascii="Times New Roman" w:hAnsi="Times New Roman" w:eastAsia="Times New Roman"/>
-                <w:b w:val="0"/>
-                <w:i w:val="0"/>
-                <w:color w:val="000000"/>
-                <w:sz w:val="22"/>
-              </w:rPr>
-              <w:t>Fig. 4.2</w:t>
-            </w:r>
-          </w:p>
-        </w:tc>
-        <w:tc>
-          <w:tcPr>
-            <w:tcW w:type="dxa" w:w="5616"/>
-          </w:tcPr>
-          <w:p>
-            <w:pPr>
-              <w:keepNext/>
-              <w:spacing w:line="240" w:lineRule="auto" w:after="40"/>
-              <w:jc w:val="center"/>
-            </w:pPr>
-            <w:r/>
-            <w:r>
-              <w:rPr>
-                <w:rFonts w:ascii="Times New Roman" w:hAnsi="Times New Roman" w:eastAsia="Times New Roman"/>
-                <w:b w:val="0"/>
-                <w:i w:val="0"/>
-                <w:color w:val="000000"/>
-                <w:sz w:val="22"/>
-              </w:rPr>
-              <w:t>Model information page, read live from saved metadata</w:t>
-            </w:r>
-          </w:p>
-        </w:tc>
-        <w:tc>
-          <w:tcPr>
-            <w:tcW w:type="dxa" w:w="1296"/>
-          </w:tcPr>
-          <w:p>
-            <w:pPr>
-              <w:keepNext/>
-              <w:spacing w:line="240" w:lineRule="auto" w:after="40"/>
-              <w:jc w:val="center"/>
-            </w:pPr>
-            <w:r/>
-            <w:r>
-              <w:rPr>
-                <w:rFonts w:ascii="Times New Roman" w:hAnsi="Times New Roman" w:eastAsia="Times New Roman"/>
-                <w:b w:val="0"/>
-                <w:i w:val="0"/>
-                <w:color w:val="000000"/>
-                <w:sz w:val="22"/>
-              </w:rPr>
-              <w:t>10</w:t>
+              <w:t>7</w:t>
             </w:r>
           </w:p>
         </w:tc>
@@ -1992,7 +1831,7 @@
                 <w:color w:val="000000"/>
                 <w:sz w:val="22"/>
               </w:rPr>
-              <w:t>Fig. 4.3</w:t>
+              <w:t>Fig. 4.2</w:t>
             </w:r>
           </w:p>
         </w:tc>
@@ -2036,18 +1875,12 @@
                 <w:color w:val="000000"/>
                 <w:sz w:val="22"/>
               </w:rPr>
-              <w:t>11</w:t>
+              <w:t>8</w:t>
             </w:r>
           </w:p>
         </w:tc>
       </w:tr>
     </w:tbl>
-    <w:p>
-      <w:pPr>
-        <w:spacing w:before="0" w:after="80" w:line="360" w:lineRule="auto"/>
-        <w:jc w:val="both"/>
-      </w:pPr>
-    </w:p>
     <w:p>
       <w:pPr>
         <w:spacing w:before="0" w:after="160" w:line="360" w:lineRule="auto"/>
@@ -2296,7 +2129,7 @@
                 <w:color w:val="000000"/>
                 <w:sz w:val="22"/>
               </w:rPr>
-              <w:t>4</w:t>
+              <w:t>3</w:t>
             </w:r>
           </w:p>
         </w:tc>
@@ -2370,7 +2203,7 @@
                 <w:color w:val="000000"/>
                 <w:sz w:val="22"/>
               </w:rPr>
-              <w:t>6</w:t>
+              <w:t>4</w:t>
             </w:r>
           </w:p>
         </w:tc>
@@ -2444,7 +2277,7 @@
                 <w:color w:val="000000"/>
                 <w:sz w:val="22"/>
               </w:rPr>
-              <w:t>6</w:t>
+              <w:t>4</w:t>
             </w:r>
           </w:p>
         </w:tc>
@@ -2518,7 +2351,7 @@
                 <w:color w:val="000000"/>
                 <w:sz w:val="22"/>
               </w:rPr>
-              <w:t>6</w:t>
+              <w:t>5</w:t>
             </w:r>
           </w:p>
         </w:tc>
@@ -2592,7 +2425,7 @@
                 <w:color w:val="000000"/>
                 <w:sz w:val="22"/>
               </w:rPr>
-              <w:t>11</w:t>
+              <w:t>7</w:t>
             </w:r>
           </w:p>
         </w:tc>
@@ -2666,7 +2499,7 @@
                 <w:color w:val="000000"/>
                 <w:sz w:val="22"/>
               </w:rPr>
-              <w:t>11</w:t>
+              <w:t>7</w:t>
             </w:r>
           </w:p>
         </w:tc>
@@ -2740,7 +2573,7 @@
                 <w:color w:val="000000"/>
                 <w:sz w:val="22"/>
               </w:rPr>
-              <w:t>12</w:t>
+              <w:t>8</w:t>
             </w:r>
           </w:p>
         </w:tc>
@@ -2814,7 +2647,7 @@
                 <w:color w:val="000000"/>
                 <w:sz w:val="22"/>
               </w:rPr>
-              <w:t>13</w:t>
+              <w:t>9</w:t>
             </w:r>
           </w:p>
         </w:tc>
@@ -2885,18 +2718,12 @@
                 <w:color w:val="000000"/>
                 <w:sz w:val="22"/>
               </w:rPr>
-              <w:t>16</w:t>
+              <w:t>11</w:t>
             </w:r>
           </w:p>
         </w:tc>
       </w:tr>
     </w:tbl>
-    <w:p>
-      <w:pPr>
-        <w:spacing w:before="0" w:after="80" w:line="360" w:lineRule="auto"/>
-        <w:jc w:val="both"/>
-      </w:pPr>
-    </w:p>
     <w:p>
       <w:pPr>
         <w:sectPr>
@@ -3019,22 +2846,6 @@
           <w:sz w:val="24"/>
         </w:rPr>
         <w:t>The problem is also statistically interesting. Only 6.68% of borrowers here are positive, and that imbalance breaks the most familiar metric: a model that always answers “no delinquency” scores 93.3% accuracy while catching nobody. Which metrics replace accuracy, and why, is a central theme of this report.</w:t>
-      </w:r>
-    </w:p>
-    <w:p>
-      <w:pPr>
-        <w:spacing w:before="0" w:after="120" w:line="360" w:lineRule="auto"/>
-        <w:jc w:val="both"/>
-      </w:pPr>
-      <w:r>
-        <w:rPr>
-          <w:rFonts w:ascii="Times New Roman" w:hAnsi="Times New Roman" w:eastAsia="Times New Roman"/>
-          <w:b w:val="0"/>
-          <w:i w:val="0"/>
-          <w:color w:val="000000"/>
-          <w:sz w:val="24"/>
-        </w:rPr>
-        <w:t>The same reasoning transfers to fraud detection, medical diagnosis and equipment failure — any rare-event prediction problem.</w:t>
       </w:r>
     </w:p>
     <w:p>
@@ -3178,7 +2989,7 @@
           <w:color w:val="000000"/>
           <w:sz w:val="24"/>
         </w:rPr>
-        <w:t>introduced Random Forests. Combining many decorrelated trees reduces variance without raising bias, and generalisation error converges as trees are added. Two sources of randomness are responsible: bootstrap sampling of rows, and restricting each split to a random feature subset.</w:t>
+        <w:t>introduced Random Forests: combining decorrelated trees reduces variance without raising bias. Two sources of randomness are responsible — bootstrap sampling of rows, and restricting each split to a random feature subset.</w:t>
       </w:r>
     </w:p>
     <w:p>
@@ -3204,59 +3015,7 @@
           <w:color w:val="000000"/>
           <w:sz w:val="24"/>
         </w:rPr>
-        <w:t>were the most influential source here. ROC plots mislead under imbalance, because the false-positive rate is measured against a large negative population and barely moves. Precision-recall plots do not, since precision counts only what was flagged. This is why the model below is selected on PR-AUC.</w:t>
-      </w:r>
-    </w:p>
-    <w:p>
-      <w:pPr>
-        <w:spacing w:before="0" w:after="120" w:line="360" w:lineRule="auto"/>
-        <w:jc w:val="both"/>
-      </w:pPr>
-      <w:r>
-        <w:rPr>
-          <w:rFonts w:ascii="Times New Roman" w:hAnsi="Times New Roman" w:eastAsia="Times New Roman"/>
-          <w:b/>
-          <w:i w:val="0"/>
-          <w:color w:val="000000"/>
-          <w:sz w:val="24"/>
-        </w:rPr>
-        <w:t xml:space="preserve">Pedregosa et al. [2] </w:t>
-      </w:r>
-      <w:r>
-        <w:rPr>
-          <w:rFonts w:ascii="Times New Roman" w:hAnsi="Times New Roman" w:eastAsia="Times New Roman"/>
-          <w:b w:val="0"/>
-          <w:i w:val="0"/>
-          <w:color w:val="000000"/>
-          <w:sz w:val="24"/>
-        </w:rPr>
-        <w:t>document scikit-learn. Its RandomForestClassifier averages per-tree leaf class proportions — not the hard majority vote introductory treatments describe. That distinction is kept throughout.</w:t>
-      </w:r>
-    </w:p>
-    <w:p>
-      <w:pPr>
-        <w:spacing w:before="0" w:after="120" w:line="360" w:lineRule="auto"/>
-        <w:jc w:val="both"/>
-      </w:pPr>
-      <w:r>
-        <w:rPr>
-          <w:rFonts w:ascii="Times New Roman" w:hAnsi="Times New Roman" w:eastAsia="Times New Roman"/>
-          <w:b/>
-          <w:i w:val="0"/>
-          <w:color w:val="000000"/>
-          <w:sz w:val="24"/>
-        </w:rPr>
-        <w:t xml:space="preserve">Chawla et al. [5] </w:t>
-      </w:r>
-      <w:r>
-        <w:rPr>
-          <w:rFonts w:ascii="Times New Roman" w:hAnsi="Times New Roman" w:eastAsia="Times New Roman"/>
-          <w:b w:val="0"/>
-          <w:i w:val="0"/>
-          <w:color w:val="000000"/>
-          <w:sz w:val="24"/>
-        </w:rPr>
-        <w:t>survey imbalance remedies: resampling and class weights. Framing the problem as choosing an operating point on a trade-off curve, rather than fixing a broken model, informed the decision here to move the threshold instead of reweighting.</w:t>
+        <w:t>were the most influential source here. ROC plots mislead under imbalance, because the false-positive rate is measured against a large negative population and barely moves; precision-recall plots do not, since precision counts only what was flagged. This is why the model below is selected on PR-AUC. Pedregosa et al. [2] document scikit-learn, whose forest averages per-tree leaf proportions rather than taking the majority vote introductory treatments describe. Chawla et al. [5] frame imbalance as a choice of operating point on a trade-off curve.</w:t>
       </w:r>
     </w:p>
     <w:p>
@@ -3877,12 +3636,6 @@
     </w:tbl>
     <w:p>
       <w:pPr>
-        <w:spacing w:before="0" w:after="80" w:line="360" w:lineRule="auto"/>
-        <w:jc w:val="both"/>
-      </w:pPr>
-    </w:p>
-    <w:p>
-      <w:pPr>
         <w:spacing w:before="160" w:after="80" w:line="360" w:lineRule="auto"/>
         <w:jc w:val="left"/>
       </w:pPr>
@@ -3910,23 +3663,7 @@
           <w:color w:val="000000"/>
           <w:sz w:val="24"/>
         </w:rPr>
-        <w:t>The literature agrees that accuracy and ROC-AUC flatter a classifier when positives are rare, yet both are still widely reported. The standard remedies are often applied without checking whether they improve ranking or merely relocate the operating point.</w:t>
-      </w:r>
-    </w:p>
-    <w:p>
-      <w:pPr>
-        <w:spacing w:before="0" w:after="120" w:line="360" w:lineRule="auto"/>
-        <w:jc w:val="both"/>
-      </w:pPr>
-      <w:r>
-        <w:rPr>
-          <w:rFonts w:ascii="Times New Roman" w:hAnsi="Times New Roman" w:eastAsia="Times New Roman"/>
-          <w:b w:val="0"/>
-          <w:i w:val="0"/>
-          <w:color w:val="000000"/>
-          <w:sz w:val="24"/>
-        </w:rPr>
-        <w:t>This work measures that. Class weighting is found to move the model along the precision-recall curve without lifting it, so explicit threshold selection is used instead. Separately, undocumented placeholder codes that much published work on this data imputes away are shown to carry real signal.</w:t>
+        <w:t>The literature agrees that accuracy and ROC-AUC flatter a classifier when positives are rare, yet both are still widely reported, and the standard remedies are often applied without checking whether they improve ranking or merely relocate the operating point. This work measures that: class weighting moves the model along the precision-recall curve without lifting it, so explicit threshold selection is used instead. Separately, undocumented placeholder codes that much published work imputes away are shown to carry real signal.</w:t>
       </w:r>
     </w:p>
     <w:p>
@@ -4092,7 +3829,7 @@
                 <w:color w:val="000000"/>
                 <w:sz w:val="20"/>
               </w:rPr>
-              <w:t>Repeatedly splits data on one attribute. Terminal nodes (leaves) hold the training samples that reached them.</w:t>
+              <w:t>Splits data repeatedly on one attribute. Leaves hold the training samples that reached them.</w:t>
             </w:r>
           </w:p>
         </w:tc>
@@ -4143,7 +3880,7 @@
                 <w:color w:val="000000"/>
                 <w:sz w:val="20"/>
               </w:rPr>
-              <w:t>G = 1 − Σ pk², where pk is the proportion of class k in a node. Zero when a node holds one class. Splits maximise the weighted reduction in G.</w:t>
+              <w:t>G = 1 − Σ pk², where pk is the proportion of class k in a node. Splits maximise its weighted reduction.</w:t>
             </w:r>
           </w:p>
         </w:tc>
@@ -4194,7 +3931,7 @@
                 <w:color w:val="000000"/>
                 <w:sz w:val="20"/>
               </w:rPr>
-              <w:t>Each tree trains on a sample drawn with replacement, so every tree sees different data. Averaging reduces variance.</w:t>
+              <w:t>Each tree trains on a sample drawn with replacement, so averaging their output reduces variance.</w:t>
             </w:r>
           </w:p>
         </w:tc>
@@ -4273,7 +4010,7 @@
                 <w:color w:val="000000"/>
                 <w:sz w:val="20"/>
               </w:rPr>
-              <w:t>Target</w:t>
+              <w:t>Precision / Recall</w:t>
             </w:r>
           </w:p>
         </w:tc>
@@ -4296,109 +4033,7 @@
                 <w:color w:val="000000"/>
                 <w:sz w:val="20"/>
               </w:rPr>
-              <w:t>SeriousDlqin2yrs — 1 if 90+ days past due within two years, else 0.</w:t>
-            </w:r>
-          </w:p>
-        </w:tc>
-      </w:tr>
-      <w:tr>
-        <w:trPr>
-          <w:cantSplit/>
-        </w:trPr>
-        <w:tc>
-          <w:tcPr>
-            <w:tcW w:type="dxa" w:w="1872"/>
-          </w:tcPr>
-          <w:p>
-            <w:pPr>
-              <w:keepNext/>
-              <w:spacing w:line="240" w:lineRule="auto" w:after="40"/>
-              <w:jc w:val="left"/>
-            </w:pPr>
-            <w:r/>
-            <w:r>
-              <w:rPr>
-                <w:rFonts w:ascii="Times New Roman" w:hAnsi="Times New Roman" w:eastAsia="Times New Roman"/>
-                <w:b w:val="0"/>
-                <w:i w:val="0"/>
-                <w:color w:val="000000"/>
-                <w:sz w:val="20"/>
-              </w:rPr>
-              <w:t>Precision</w:t>
-            </w:r>
-          </w:p>
-        </w:tc>
-        <w:tc>
-          <w:tcPr>
-            <w:tcW w:type="dxa" w:w="6480"/>
-          </w:tcPr>
-          <w:p>
-            <w:pPr>
-              <w:keepNext/>
-              <w:spacing w:line="240" w:lineRule="auto" w:after="40"/>
-              <w:jc w:val="center"/>
-            </w:pPr>
-            <w:r/>
-            <w:r>
-              <w:rPr>
-                <w:rFonts w:ascii="Times New Roman" w:hAnsi="Times New Roman" w:eastAsia="Times New Roman"/>
-                <w:b w:val="0"/>
-                <w:i w:val="0"/>
-                <w:color w:val="000000"/>
-                <w:sz w:val="20"/>
-              </w:rPr>
-              <w:t>Of those flagged, the share truly delinquent. TP / (TP + FP).</w:t>
-            </w:r>
-          </w:p>
-        </w:tc>
-      </w:tr>
-      <w:tr>
-        <w:trPr>
-          <w:cantSplit/>
-        </w:trPr>
-        <w:tc>
-          <w:tcPr>
-            <w:tcW w:type="dxa" w:w="1872"/>
-          </w:tcPr>
-          <w:p>
-            <w:pPr>
-              <w:keepNext/>
-              <w:spacing w:line="240" w:lineRule="auto" w:after="40"/>
-              <w:jc w:val="left"/>
-            </w:pPr>
-            <w:r/>
-            <w:r>
-              <w:rPr>
-                <w:rFonts w:ascii="Times New Roman" w:hAnsi="Times New Roman" w:eastAsia="Times New Roman"/>
-                <w:b w:val="0"/>
-                <w:i w:val="0"/>
-                <w:color w:val="000000"/>
-                <w:sz w:val="20"/>
-              </w:rPr>
-              <w:t>Recall</w:t>
-            </w:r>
-          </w:p>
-        </w:tc>
-        <w:tc>
-          <w:tcPr>
-            <w:tcW w:type="dxa" w:w="6480"/>
-          </w:tcPr>
-          <w:p>
-            <w:pPr>
-              <w:keepNext/>
-              <w:spacing w:line="240" w:lineRule="auto" w:after="40"/>
-              <w:jc w:val="center"/>
-            </w:pPr>
-            <w:r/>
-            <w:r>
-              <w:rPr>
-                <w:rFonts w:ascii="Times New Roman" w:hAnsi="Times New Roman" w:eastAsia="Times New Roman"/>
-                <w:b w:val="0"/>
-                <w:i w:val="0"/>
-                <w:color w:val="000000"/>
-                <w:sz w:val="20"/>
-              </w:rPr>
-              <w:t>Of the truly delinquent, the share found. TP / (TP + FN).</w:t>
+              <w:t>Of those flagged, the share truly delinquent — TP/(TP+FP). Of the truly delinquent, the share found — TP/(TP+FN).</w:t>
             </w:r>
           </w:p>
         </w:tc>
@@ -4449,7 +4084,7 @@
                 <w:color w:val="000000"/>
                 <w:sz w:val="20"/>
               </w:rPr>
-              <w:t>Harmonic mean 2PR / (P + R); dominated by the weaker of the two.</w:t>
+              <w:t>Harmonic mean 2PR/(P+R); dominated by the weaker term.</w:t>
             </w:r>
           </w:p>
         </w:tc>
@@ -4515,7 +4150,6 @@
           </w:tcPr>
           <w:p>
             <w:pPr>
-              <w:keepNext/>
               <w:spacing w:line="240" w:lineRule="auto" w:after="40"/>
               <w:jc w:val="left"/>
             </w:pPr>
@@ -4538,7 +4172,6 @@
           </w:tcPr>
           <w:p>
             <w:pPr>
-              <w:keepNext/>
               <w:spacing w:line="240" w:lineRule="auto" w:after="40"/>
               <w:jc w:val="center"/>
             </w:pPr>
@@ -4556,62 +4189,7 @@
           </w:p>
         </w:tc>
       </w:tr>
-      <w:tr>
-        <w:trPr>
-          <w:cantSplit/>
-        </w:trPr>
-        <w:tc>
-          <w:tcPr>
-            <w:tcW w:type="dxa" w:w="1872"/>
-          </w:tcPr>
-          <w:p>
-            <w:pPr>
-              <w:spacing w:line="240" w:lineRule="auto" w:after="40"/>
-              <w:jc w:val="left"/>
-            </w:pPr>
-            <w:r/>
-            <w:r>
-              <w:rPr>
-                <w:rFonts w:ascii="Times New Roman" w:hAnsi="Times New Roman" w:eastAsia="Times New Roman"/>
-                <w:b w:val="0"/>
-                <w:i w:val="0"/>
-                <w:color w:val="000000"/>
-                <w:sz w:val="20"/>
-              </w:rPr>
-              <w:t>Threshold</w:t>
-            </w:r>
-          </w:p>
-        </w:tc>
-        <w:tc>
-          <w:tcPr>
-            <w:tcW w:type="dxa" w:w="6480"/>
-          </w:tcPr>
-          <w:p>
-            <w:pPr>
-              <w:spacing w:line="240" w:lineRule="auto" w:after="40"/>
-              <w:jc w:val="center"/>
-            </w:pPr>
-            <w:r/>
-            <w:r>
-              <w:rPr>
-                <w:rFonts w:ascii="Times New Roman" w:hAnsi="Times New Roman" w:eastAsia="Times New Roman"/>
-                <w:b w:val="0"/>
-                <w:i w:val="0"/>
-                <w:color w:val="000000"/>
-                <w:sz w:val="20"/>
-              </w:rPr>
-              <w:t>The probability above which a prediction is reported positive. Chosen after training.</w:t>
-            </w:r>
-          </w:p>
-        </w:tc>
-      </w:tr>
     </w:tbl>
-    <w:p>
-      <w:pPr>
-        <w:spacing w:before="0" w:after="80" w:line="360" w:lineRule="auto"/>
-        <w:jc w:val="both"/>
-      </w:pPr>
-    </w:p>
     <w:p>
       <w:pPr>
         <w:spacing w:before="160" w:after="120" w:line="360" w:lineRule="auto"/>
@@ -4625,7 +4203,7 @@
           <w:color w:val="000000"/>
           <w:sz w:val="28"/>
         </w:rPr>
-        <w:t>3.2 Architecture</w:t>
+        <w:t>3.2 Architecture and Working</w:t>
       </w:r>
     </w:p>
     <w:p>
@@ -4641,7 +4219,7 @@
           <w:color w:val="000000"/>
           <w:sz w:val="24"/>
         </w:rPr>
-        <w:t>Training, evaluation and figure generation run offline and produce one saved artifact. The web service loads it at startup and scores requests; it never trains.</w:t>
+        <w:t>Training, evaluation and figure generation run offline and produce one saved artifact. The web service loads it at startup and scores requests; it never trains. The browser talks to one origin only — requests to /api are forwarded server-side, so no cross-origin request is ever made.</w:t>
       </w:r>
     </w:p>
     <w:p>
@@ -4653,7 +4231,7 @@
       <w:r>
         <w:drawing>
           <wp:inline xmlns:a="http://schemas.openxmlformats.org/drawingml/2006/main" xmlns:pic="http://schemas.openxmlformats.org/drawingml/2006/picture">
-            <wp:extent cx="5303520" cy="2298192"/>
+            <wp:extent cx="4572000" cy="1981200"/>
             <wp:docPr id="1" name="Picture 1"/>
             <wp:cNvGraphicFramePr>
               <a:graphicFrameLocks noChangeAspect="1"/>
@@ -4674,7 +4252,7 @@
                   <pic:spPr>
                     <a:xfrm>
                       <a:off x="0" y="0"/>
-                      <a:ext cx="5303520" cy="2298192"/>
+                      <a:ext cx="4572000" cy="1981200"/>
                     </a:xfrm>
                     <a:prstGeom prst="rect"/>
                   </pic:spPr>
@@ -4714,23 +4292,7 @@
           <w:color w:val="000000"/>
           <w:sz w:val="24"/>
         </w:rPr>
-        <w:t>The browser talks to one origin only — requests to /api are forwarded server-side, so no cross-origin request is ever made.</w:t>
-      </w:r>
-    </w:p>
-    <w:p>
-      <w:pPr>
-        <w:spacing w:before="160" w:after="80" w:line="360" w:lineRule="auto"/>
-        <w:jc w:val="left"/>
-      </w:pPr>
-      <w:r>
-        <w:rPr>
-          <w:rFonts w:ascii="Times New Roman" w:hAnsi="Times New Roman" w:eastAsia="Times New Roman"/>
-          <w:b/>
-          <w:i w:val="0"/>
-          <w:color w:val="000000"/>
-          <w:sz w:val="28"/>
-        </w:rPr>
-        <w:t>Training pipeline.</w:t>
+        <w:t>Training runs in six stages: load and validate against a schema; mark implausible values missing; split 60/20/20 stratified; compare five candidates on validation; select the threshold; score once on test. Every fitted quantity — imputation medians, model parameters, the threshold — comes from train and validation only. Stratifying matters at a 6.68% base rate, or the three parts would carry different class ratios and their metrics would not be comparable.</w:t>
       </w:r>
     </w:p>
     <w:p>
@@ -4746,112 +4308,7 @@
           <w:color w:val="000000"/>
           <w:sz w:val="24"/>
         </w:rPr>
-        <w:t>Six stages: load and validate against a schema; mark implausible values missing; split 60/20/20 stratified; compare five candidates on validation; select the threshold; score once on the test split.</w:t>
-      </w:r>
-    </w:p>
-    <w:p>
-      <w:pPr>
-        <w:spacing w:before="0" w:after="120" w:line="360" w:lineRule="auto"/>
-        <w:jc w:val="both"/>
-      </w:pPr>
-      <w:r>
-        <w:rPr>
-          <w:rFonts w:ascii="Times New Roman" w:hAnsi="Times New Roman" w:eastAsia="Times New Roman"/>
-          <w:b w:val="0"/>
-          <w:i w:val="0"/>
-          <w:color w:val="000000"/>
-          <w:sz w:val="24"/>
-        </w:rPr>
-        <w:t>Every fitted quantity — imputation medians, model parameters, the threshold — comes from train and validation only. The test split is held in reserve until the final stage. Stratifying matters at a 6.68% base rate: an unstratified split could leave the three parts with different class ratios, making their metrics incomparable.</w:t>
-      </w:r>
-    </w:p>
-    <w:p>
-      <w:pPr>
-        <w:spacing w:before="160" w:after="120" w:line="360" w:lineRule="auto"/>
-        <w:jc w:val="left"/>
-      </w:pPr>
-      <w:r>
-        <w:rPr>
-          <w:rFonts w:ascii="Times New Roman" w:hAnsi="Times New Roman" w:eastAsia="Times New Roman"/>
-          <w:b/>
-          <w:i w:val="0"/>
-          <w:color w:val="000000"/>
-          <w:sz w:val="28"/>
-        </w:rPr>
-        <w:t>3.3 How a Prediction Is Made</w:t>
-      </w:r>
-    </w:p>
-    <w:p>
-      <w:pPr>
-        <w:keepNext/>
-        <w:spacing w:before="160" w:after="40"/>
-        <w:jc w:val="center"/>
-      </w:pPr>
-      <w:r>
-        <w:drawing>
-          <wp:inline xmlns:a="http://schemas.openxmlformats.org/drawingml/2006/main" xmlns:pic="http://schemas.openxmlformats.org/drawingml/2006/picture">
-            <wp:extent cx="5303520" cy="1944624"/>
-            <wp:docPr id="2" name="Picture 2"/>
-            <wp:cNvGraphicFramePr>
-              <a:graphicFrameLocks noChangeAspect="1"/>
-            </wp:cNvGraphicFramePr>
-            <a:graphic>
-              <a:graphicData uri="http://schemas.openxmlformats.org/drawingml/2006/picture">
-                <pic:pic>
-                  <pic:nvPicPr>
-                    <pic:cNvPr id="0" name="random-forest.png"/>
-                    <pic:cNvPicPr/>
-                  </pic:nvPicPr>
-                  <pic:blipFill>
-                    <a:blip r:embed="rId12"/>
-                    <a:stretch>
-                      <a:fillRect/>
-                    </a:stretch>
-                  </pic:blipFill>
-                  <pic:spPr>
-                    <a:xfrm>
-                      <a:off x="0" y="0"/>
-                      <a:ext cx="5303520" cy="1944624"/>
-                    </a:xfrm>
-                    <a:prstGeom prst="rect"/>
-                  </pic:spPr>
-                </pic:pic>
-              </a:graphicData>
-            </a:graphic>
-          </wp:inline>
-        </w:drawing>
-      </w:r>
-    </w:p>
-    <w:p>
-      <w:pPr>
-        <w:spacing w:before="40" w:after="160" w:line="240" w:lineRule="auto"/>
-        <w:jc w:val="center"/>
-      </w:pPr>
-      <w:r>
-        <w:rPr>
-          <w:rFonts w:ascii="Times New Roman" w:hAnsi="Times New Roman" w:eastAsia="Times New Roman"/>
-          <w:b w:val="0"/>
-          <w:i/>
-          <w:color w:val="000000"/>
-          <w:sz w:val="22"/>
-        </w:rPr>
-        <w:t>Figure 3.2: How a Random Forest produces a prediction</w:t>
-      </w:r>
-    </w:p>
-    <w:p>
-      <w:pPr>
-        <w:spacing w:before="0" w:after="120" w:line="360" w:lineRule="auto"/>
-        <w:jc w:val="both"/>
-      </w:pPr>
-      <w:r>
-        <w:rPr>
-          <w:rFonts w:ascii="Times New Roman" w:hAnsi="Times New Roman" w:eastAsia="Times New Roman"/>
-          <w:b w:val="0"/>
-          <w:i w:val="0"/>
-          <w:color w:val="000000"/>
-          <w:sz w:val="24"/>
-        </w:rPr>
-        <w:t>Each of the 300 trees routes the record to a leaf and reports that leaf's positive proportion. The forest averages those 300 values — scikit-learn averages per-tree probabilities rather than taking a majority vote. The mean is compared with the threshold of 0.2302 to give a class.</w:t>
+        <w:t>To predict, each of the 300 trees routes the record to a leaf and reports that leaf's positive proportion. The forest averages those 300 values — scikit-learn averages per-tree probabilities rather than taking a majority vote — and the mean is compared with the threshold of 0.2302 to give a class.</w:t>
       </w:r>
     </w:p>
     <w:p>
@@ -5481,12 +4938,6 @@
     </w:tbl>
     <w:p>
       <w:pPr>
-        <w:spacing w:before="0" w:after="80" w:line="360" w:lineRule="auto"/>
-        <w:jc w:val="both"/>
-      </w:pPr>
-    </w:p>
-    <w:p>
-      <w:pPr>
         <w:keepNext/>
         <w:spacing w:before="160" w:after="60" w:line="240" w:lineRule="auto"/>
         <w:jc w:val="center"/>
@@ -6036,12 +5487,6 @@
         </w:tc>
       </w:tr>
     </w:tbl>
-    <w:p>
-      <w:pPr>
-        <w:spacing w:before="0" w:after="80" w:line="360" w:lineRule="auto"/>
-        <w:jc w:val="both"/>
-      </w:pPr>
-    </w:p>
     <w:p>
       <w:pPr>
         <w:spacing w:before="0" w:after="120" w:line="360" w:lineRule="auto"/>
@@ -6847,12 +6292,6 @@
     </w:tbl>
     <w:p>
       <w:pPr>
-        <w:spacing w:before="0" w:after="80" w:line="360" w:lineRule="auto"/>
-        <w:jc w:val="both"/>
-      </w:pPr>
-    </w:p>
-    <w:p>
-      <w:pPr>
         <w:spacing w:before="0" w:after="120" w:line="360" w:lineRule="auto"/>
         <w:jc w:val="both"/>
       </w:pPr>
@@ -6945,7 +6384,7 @@
           <w:color w:val="000000"/>
           <w:sz w:val="24"/>
         </w:rPr>
-        <w:t xml:space="preserve">Application scoring. </w:t>
+        <w:t xml:space="preserve">Application scoring </w:t>
       </w:r>
       <w:r>
         <w:rPr>
@@ -6955,14 +6394,8 @@
           <w:color w:val="000000"/>
           <w:sz w:val="24"/>
         </w:rPr>
-        <w:t>A score at origination, combined with policy rules and affordability checks. Every applicant is assessed on the same basis in milliseconds. The system below demonstrates this directly.</w:t>
+        <w:t xml:space="preserve">gives a risk score at origination, combined with policy rules and affordability checks, so every applicant is assessed on the same basis in milliseconds. </w:t>
       </w:r>
-    </w:p>
-    <w:p>
-      <w:pPr>
-        <w:spacing w:before="0" w:after="120" w:line="360" w:lineRule="auto"/>
-        <w:jc w:val="both"/>
-      </w:pPr>
       <w:r>
         <w:rPr>
           <w:rFonts w:ascii="Times New Roman" w:hAnsi="Times New Roman" w:eastAsia="Times New Roman"/>
@@ -6971,7 +6404,7 @@
           <w:color w:val="000000"/>
           <w:sz w:val="24"/>
         </w:rPr>
-        <w:t xml:space="preserve">Behavioural scoring. </w:t>
+        <w:t xml:space="preserve">Behavioural scoring </w:t>
       </w:r>
       <w:r>
         <w:rPr>
@@ -6981,14 +6414,8 @@
           <w:color w:val="000000"/>
           <w:sz w:val="24"/>
         </w:rPr>
-        <w:t>Rescoring an existing portfolio as payment behaviour accumulates, to catch accounts drifting toward delinquency early enough to intervene.</w:t>
+        <w:t xml:space="preserve">rescores an existing portfolio as payment behaviour accumulates, catching accounts drifting toward delinquency early enough to intervene. </w:t>
       </w:r>
-    </w:p>
-    <w:p>
-      <w:pPr>
-        <w:spacing w:before="0" w:after="120" w:line="360" w:lineRule="auto"/>
-        <w:jc w:val="both"/>
-      </w:pPr>
       <w:r>
         <w:rPr>
           <w:rFonts w:ascii="Times New Roman" w:hAnsi="Times New Roman" w:eastAsia="Times New Roman"/>
@@ -6997,7 +6424,7 @@
           <w:color w:val="000000"/>
           <w:sz w:val="24"/>
         </w:rPr>
-        <w:t xml:space="preserve">Collections prioritisation. </w:t>
+        <w:t xml:space="preserve">Collections prioritisation </w:t>
       </w:r>
       <w:r>
         <w:rPr>
@@ -7007,7 +6434,7 @@
           <w:color w:val="000000"/>
           <w:sz w:val="24"/>
         </w:rPr>
-        <w:t>Ranking delinquent accounts so finite recovery effort goes where it matters. Needs only the ranking, not a calibrated probability.</w:t>
+        <w:t>ranks delinquent accounts so finite recovery effort goes where it matters; it needs only the ranking, not a calibrated probability.</w:t>
       </w:r>
     </w:p>
     <w:p>
@@ -7023,23 +6450,7 @@
           <w:color w:val="000000"/>
           <w:sz w:val="24"/>
         </w:rPr>
-        <w:t>The technique generalises to any rare-event problem on tabular data: fraud detection, claim triage, churn, predictive maintenance, clinical risk scoring.</w:t>
-      </w:r>
-    </w:p>
-    <w:p>
-      <w:pPr>
-        <w:spacing w:before="0" w:after="120" w:line="360" w:lineRule="auto"/>
-        <w:jc w:val="both"/>
-      </w:pPr>
-      <w:r>
-        <w:rPr>
-          <w:rFonts w:ascii="Times New Roman" w:hAnsi="Times New Roman" w:eastAsia="Times New Roman"/>
-          <w:b w:val="0"/>
-          <w:i w:val="0"/>
-          <w:color w:val="000000"/>
-          <w:sz w:val="24"/>
-        </w:rPr>
-        <w:t>The benefits are consistency, scale and inspectability — identical criteria for every applicant, at volumes no manual process could reach, with the attributes the model relies on open to scrutiny.</w:t>
+        <w:t>The technique generalises to any rare-event problem on tabular data — fraud detection, claim triage, churn, predictive maintenance. The benefits are consistency, scale and inspectability: identical criteria for every applicant, at volumes no manual process could reach.</w:t>
       </w:r>
     </w:p>
     <w:p>
@@ -7071,7 +6482,7 @@
           <w:color w:val="000000"/>
           <w:sz w:val="24"/>
         </w:rPr>
-        <w:t>The model is deployed at https://delinquency-risk.vercel.app, with API documentation at https://loan-default-api.vercel.app/docs. Four pages: Dashboard, Predict, Result and Model info. All displayed values are fetched from the service at run time.</w:t>
+        <w:t>The model is deployed at https://delinquency-risk.vercel.app, with API documentation at https://loan-default-api.vercel.app/docs. Four pages — Dashboard, Predict, Result and Model info — all fetching their values from the service at run time. The dashboard states what the model does and does not do, and shows the majority-class baseline beside the accuracy so the latter cannot be mistaken for a strong result.</w:t>
       </w:r>
     </w:p>
     <w:p>
@@ -7083,8 +6494,8 @@
       <w:r>
         <w:drawing>
           <wp:inline xmlns:a="http://schemas.openxmlformats.org/drawingml/2006/main" xmlns:pic="http://schemas.openxmlformats.org/drawingml/2006/picture">
-            <wp:extent cx="5212080" cy="4652467"/>
-            <wp:docPr id="3" name="Picture 3"/>
+            <wp:extent cx="4480560" cy="3999489"/>
+            <wp:docPr id="2" name="Picture 2"/>
             <wp:cNvGraphicFramePr>
               <a:graphicFrameLocks noChangeAspect="1"/>
             </wp:cNvGraphicFramePr>
@@ -7096,7 +6507,7 @@
                     <pic:cNvPicPr/>
                   </pic:nvPicPr>
                   <pic:blipFill>
-                    <a:blip r:embed="rId13"/>
+                    <a:blip r:embed="rId12"/>
                     <a:stretch>
                       <a:fillRect/>
                     </a:stretch>
@@ -7104,7 +6515,7 @@
                   <pic:spPr>
                     <a:xfrm>
                       <a:off x="0" y="0"/>
-                      <a:ext cx="5212080" cy="4652467"/>
+                      <a:ext cx="4480560" cy="3999489"/>
                     </a:xfrm>
                     <a:prstGeom prst="rect"/>
                   </pic:spPr>
@@ -7129,95 +6540,6 @@
           <w:sz w:val="22"/>
         </w:rPr>
         <w:t>Figure 4.1: Dashboard of the deployed application</w:t>
-      </w:r>
-    </w:p>
-    <w:p>
-      <w:pPr>
-        <w:spacing w:before="0" w:after="120" w:line="360" w:lineRule="auto"/>
-        <w:jc w:val="both"/>
-      </w:pPr>
-      <w:r>
-        <w:rPr>
-          <w:rFonts w:ascii="Times New Roman" w:hAnsi="Times New Roman" w:eastAsia="Times New Roman"/>
-          <w:b w:val="0"/>
-          <w:i w:val="0"/>
-          <w:color w:val="000000"/>
-          <w:sz w:val="24"/>
-        </w:rPr>
-        <w:t>The dashboard states what the model does and does not do, and shows the majority-class baseline beside the accuracy so the latter cannot be mistaken for a strong result.</w:t>
-      </w:r>
-    </w:p>
-    <w:p>
-      <w:pPr>
-        <w:keepNext/>
-        <w:spacing w:before="160" w:after="40"/>
-        <w:jc w:val="center"/>
-      </w:pPr>
-      <w:r>
-        <w:drawing>
-          <wp:inline xmlns:a="http://schemas.openxmlformats.org/drawingml/2006/main" xmlns:pic="http://schemas.openxmlformats.org/drawingml/2006/picture">
-            <wp:extent cx="4937760" cy="6063916"/>
-            <wp:docPr id="4" name="Picture 4"/>
-            <wp:cNvGraphicFramePr>
-              <a:graphicFrameLocks noChangeAspect="1"/>
-            </wp:cNvGraphicFramePr>
-            <a:graphic>
-              <a:graphicData uri="http://schemas.openxmlformats.org/drawingml/2006/picture">
-                <pic:pic>
-                  <pic:nvPicPr>
-                    <pic:cNvPr id="0" name="04-model-info.png"/>
-                    <pic:cNvPicPr/>
-                  </pic:nvPicPr>
-                  <pic:blipFill>
-                    <a:blip r:embed="rId14"/>
-                    <a:stretch>
-                      <a:fillRect/>
-                    </a:stretch>
-                  </pic:blipFill>
-                  <pic:spPr>
-                    <a:xfrm>
-                      <a:off x="0" y="0"/>
-                      <a:ext cx="4937760" cy="6063916"/>
-                    </a:xfrm>
-                    <a:prstGeom prst="rect"/>
-                  </pic:spPr>
-                </pic:pic>
-              </a:graphicData>
-            </a:graphic>
-          </wp:inline>
-        </w:drawing>
-      </w:r>
-    </w:p>
-    <w:p>
-      <w:pPr>
-        <w:spacing w:before="40" w:after="160" w:line="240" w:lineRule="auto"/>
-        <w:jc w:val="center"/>
-      </w:pPr>
-      <w:r>
-        <w:rPr>
-          <w:rFonts w:ascii="Times New Roman" w:hAnsi="Times New Roman" w:eastAsia="Times New Roman"/>
-          <w:b w:val="0"/>
-          <w:i/>
-          <w:color w:val="000000"/>
-          <w:sz w:val="22"/>
-        </w:rPr>
-        <w:t>Figure 4.2: Model information page, read live from the saved metadata</w:t>
-      </w:r>
-    </w:p>
-    <w:p>
-      <w:pPr>
-        <w:spacing w:before="0" w:after="120" w:line="360" w:lineRule="auto"/>
-        <w:jc w:val="both"/>
-      </w:pPr>
-      <w:r>
-        <w:rPr>
-          <w:rFonts w:ascii="Times New Roman" w:hAnsi="Times New Roman" w:eastAsia="Times New Roman"/>
-          <w:b w:val="0"/>
-          <w:i w:val="0"/>
-          <w:color w:val="000000"/>
-          <w:sz w:val="24"/>
-        </w:rPr>
-        <w:t>The form exposes exactly the ten trained attributes with readable labels; the result page separates the probability, the thresholded class and an illustrative risk band.</w:t>
       </w:r>
     </w:p>
     <w:p>
@@ -7803,12 +7125,6 @@
         </w:tc>
       </w:tr>
     </w:tbl>
-    <w:p>
-      <w:pPr>
-        <w:spacing w:before="0" w:after="80" w:line="360" w:lineRule="auto"/>
-        <w:jc w:val="both"/>
-      </w:pPr>
-    </w:p>
     <w:p>
       <w:pPr>
         <w:keepNext/>
@@ -8566,12 +7882,6 @@
     </w:tbl>
     <w:p>
       <w:pPr>
-        <w:spacing w:before="0" w:after="80" w:line="360" w:lineRule="auto"/>
-        <w:jc w:val="both"/>
-      </w:pPr>
-    </w:p>
-    <w:p>
-      <w:pPr>
         <w:spacing w:before="0" w:after="120" w:line="360" w:lineRule="auto"/>
         <w:jc w:val="both"/>
       </w:pPr>
@@ -8583,23 +7893,7 @@
           <w:color w:val="000000"/>
           <w:sz w:val="24"/>
         </w:rPr>
-        <w:t>This is the imbalance problem in one table. The model scores 0.9568 F1 on the majority class and 0.4482 on the minority. The weighted average of 0.9228 looks impressive but is dominated by 27,995 negatives and says almost nothing about the class the system exists to find. Quote the macro average (0.7025) or the positive-class F1 — never the weighted one.</w:t>
-      </w:r>
-    </w:p>
-    <w:p>
-      <w:pPr>
-        <w:spacing w:before="160" w:after="80" w:line="360" w:lineRule="auto"/>
-        <w:jc w:val="left"/>
-      </w:pPr>
-      <w:r>
-        <w:rPr>
-          <w:rFonts w:ascii="Times New Roman" w:hAnsi="Times New Roman" w:eastAsia="Times New Roman"/>
-          <w:b/>
-          <w:i w:val="0"/>
-          <w:color w:val="000000"/>
-          <w:sz w:val="28"/>
-        </w:rPr>
-        <w:t>Why the errors occur.</w:t>
+        <w:t>This is the imbalance problem in one table: 0.9568 F1 on the majority class against 0.4482 on the minority. The weighted average of 0.9228 looks impressive but is dominated by 27,995 negatives. Quote the macro average (0.7025) or the positive-class F1 — never the weighted one.</w:t>
       </w:r>
     </w:p>
     <w:p>
@@ -8611,8 +7905,8 @@
       <w:r>
         <w:drawing>
           <wp:inline xmlns:a="http://schemas.openxmlformats.org/drawingml/2006/main" xmlns:pic="http://schemas.openxmlformats.org/drawingml/2006/picture">
-            <wp:extent cx="4937760" cy="1729280"/>
-            <wp:docPr id="5" name="Picture 5"/>
+            <wp:extent cx="4389120" cy="1537138"/>
+            <wp:docPr id="3" name="Picture 3"/>
             <wp:cNvGraphicFramePr>
               <a:graphicFrameLocks noChangeAspect="1"/>
             </wp:cNvGraphicFramePr>
@@ -8624,7 +7918,7 @@
                     <pic:cNvPicPr/>
                   </pic:nvPicPr>
                   <pic:blipFill>
-                    <a:blip r:embed="rId15"/>
+                    <a:blip r:embed="rId13"/>
                     <a:stretch>
                       <a:fillRect/>
                     </a:stretch>
@@ -8632,7 +7926,7 @@
                   <pic:spPr>
                     <a:xfrm>
                       <a:off x="0" y="0"/>
-                      <a:ext cx="4937760" cy="1729280"/>
+                      <a:ext cx="4389120" cy="1537138"/>
                     </a:xfrm>
                     <a:prstGeom prst="rect"/>
                   </pic:spPr>
@@ -8656,7 +7950,7 @@
           <w:color w:val="000000"/>
           <w:sz w:val="22"/>
         </w:rPr>
-        <w:t>Figure 4.3: Predicted score distribution by actual outcome</w:t>
+        <w:t>Figure 4.2: Predicted score distribution by actual outcome</w:t>
       </w:r>
     </w:p>
     <w:p>
@@ -8672,7 +7966,7 @@
           <w:color w:val="000000"/>
           <w:sz w:val="24"/>
         </w:rPr>
-        <w:t>Most borrowers who stayed current score near zero. Those who became delinquent are spread across the whole range rather than clustered high, so many fall inside the same region as healthy borrowers. That overlap — not a defect in the implementation — is what limits recall.</w:t>
+        <w:t>Most borrowers who stayed current score near zero, but those who became delinquent are spread across the whole range rather than clustered high. That overlap — not a defect in the implementation — is what limits recall.</w:t>
       </w:r>
     </w:p>
     <w:p>
@@ -9571,12 +8865,6 @@
     </w:tbl>
     <w:p>
       <w:pPr>
-        <w:spacing w:before="0" w:after="80" w:line="360" w:lineRule="auto"/>
-        <w:jc w:val="both"/>
-      </w:pPr>
-    </w:p>
-    <w:p>
-      <w:pPr>
         <w:spacing w:before="0" w:after="120" w:line="360" w:lineRule="auto"/>
         <w:jc w:val="both"/>
       </w:pPr>
@@ -9588,23 +8876,7 @@
           <w:color w:val="000000"/>
           <w:sz w:val="24"/>
         </w:rPr>
-        <w:t>The same model behaves very differently depending on the cut-off. At 0.10 recall exceeds 0.70 but precision falls to 0.26 — three in four flags are false alarms. At 0.50 precision passes 0.62 but only one delinquency in six is found. Accuracy rises monotonically simply because the model answers “no” more often, which is a further reason not to trust it here.</w:t>
-      </w:r>
-    </w:p>
-    <w:p>
-      <w:pPr>
-        <w:spacing w:before="160" w:after="80" w:line="360" w:lineRule="auto"/>
-        <w:jc w:val="left"/>
-      </w:pPr>
-      <w:r>
-        <w:rPr>
-          <w:rFonts w:ascii="Times New Roman" w:hAnsi="Times New Roman" w:eastAsia="Times New Roman"/>
-          <w:b/>
-          <w:i w:val="0"/>
-          <w:color w:val="000000"/>
-          <w:sz w:val="28"/>
-        </w:rPr>
-        <w:t>Stability.</w:t>
+        <w:t>The same model behaves very differently by cut-off: at 0.10 recall exceeds 0.70 but three in four flags are false alarms; at 0.50 precision passes 0.62 but only one delinquency in six is found. Accuracy rises monotonically simply because the model answers “no” more often — a further reason not to trust it here.</w:t>
       </w:r>
     </w:p>
     <w:p>
@@ -9620,23 +8892,7 @@
           <w:color w:val="000000"/>
           <w:sz w:val="24"/>
         </w:rPr>
-        <w:t>Five-fold cross-validation on train + validation, test excluded throughout, gives ROC-AUC 0.8632 ± 0.0053 and PR-AUC 0.3978 ± 0.0148. The test values sit within one standard deviation of both, so the result is not a lucky split.</w:t>
-      </w:r>
-    </w:p>
-    <w:p>
-      <w:pPr>
-        <w:spacing w:before="0" w:after="120" w:line="360" w:lineRule="auto"/>
-        <w:jc w:val="both"/>
-      </w:pPr>
-      <w:r>
-        <w:rPr>
-          <w:rFonts w:ascii="Times New Roman" w:hAnsi="Times New Roman" w:eastAsia="Times New Roman"/>
-          <w:b w:val="0"/>
-          <w:i w:val="0"/>
-          <w:color w:val="000000"/>
-          <w:sz w:val="24"/>
-        </w:rPr>
-        <w:t>ROC-AUC falls from 0.9329 in-sample to 0.8654 held-out, a gap of 0.0675. Some overfitting remains despite regularisation; it is reported rather than concealed.</w:t>
+        <w:t>Five-fold cross-validation on train + validation, test excluded throughout, gives ROC-AUC 0.8632 ± 0.0053 and PR-AUC 0.3978 ± 0.0148; the test values sit within one standard deviation of both, so the result is not a lucky split. ROC-AUC does fall from 0.9329 in-sample to 0.8654 held-out, a gap of 0.0675 — some overfitting remains despite regularisation, and is reported rather than concealed.</w:t>
       </w:r>
     </w:p>
     <w:p>
@@ -9654,6 +8910,194 @@
           <w:sz w:val="32"/>
         </w:rPr>
         <w:t>CHAPTER 5: ADVANTAGES AND LIMITATIONS</w:t>
+      </w:r>
+    </w:p>
+    <w:p>
+      <w:pPr>
+        <w:spacing w:before="160" w:after="120" w:line="360" w:lineRule="auto"/>
+        <w:jc w:val="left"/>
+      </w:pPr>
+      <w:r>
+        <w:rPr>
+          <w:rFonts w:ascii="Times New Roman" w:hAnsi="Times New Roman" w:eastAsia="Times New Roman"/>
+          <w:b/>
+          <w:i w:val="0"/>
+          <w:color w:val="000000"/>
+          <w:sz w:val="28"/>
+        </w:rPr>
+        <w:t>5.1 Key Limitations</w:t>
+      </w:r>
+    </w:p>
+    <w:p>
+      <w:pPr>
+        <w:spacing w:before="0" w:after="120" w:line="360" w:lineRule="auto"/>
+        <w:jc w:val="both"/>
+      </w:pPr>
+      <w:r>
+        <w:rPr>
+          <w:rFonts w:ascii="Times New Roman" w:hAnsi="Times New Roman" w:eastAsia="Times New Roman"/>
+          <w:b/>
+          <w:i w:val="0"/>
+          <w:color w:val="000000"/>
+          <w:sz w:val="24"/>
+        </w:rPr>
+        <w:t xml:space="preserve">Data, not algorithm. </w:t>
+      </w:r>
+      <w:r>
+        <w:rPr>
+          <w:rFonts w:ascii="Times New Roman" w:hAnsi="Times New Roman" w:eastAsia="Times New Roman"/>
+          <w:b w:val="0"/>
+          <w:i w:val="0"/>
+          <w:color w:val="000000"/>
+          <w:sz w:val="24"/>
+        </w:rPr>
+        <w:t>US consumers around 2011, with no date column — so no out-of-time validation is possible and the sampling frame is undocumented.</w:t>
+      </w:r>
+    </w:p>
+    <w:p>
+      <w:pPr>
+        <w:spacing w:before="0" w:after="120" w:line="360" w:lineRule="auto"/>
+        <w:jc w:val="both"/>
+      </w:pPr>
+      <w:r>
+        <w:rPr>
+          <w:rFonts w:ascii="Times New Roman" w:hAnsi="Times New Roman" w:eastAsia="Times New Roman"/>
+          <w:b/>
+          <w:i w:val="0"/>
+          <w:color w:val="000000"/>
+          <w:sz w:val="24"/>
+        </w:rPr>
+        <w:t xml:space="preserve">Uncalibrated. </w:t>
+      </w:r>
+      <w:r>
+        <w:rPr>
+          <w:rFonts w:ascii="Times New Roman" w:hAnsi="Times New Roman" w:eastAsia="Times New Roman"/>
+          <w:b w:val="0"/>
+          <w:i w:val="0"/>
+          <w:color w:val="000000"/>
+          <w:sz w:val="24"/>
+        </w:rPr>
+        <w:t>A predicted 0.30 is a ranking score, not a claim that 30 in 100 such borrowers default.</w:t>
+      </w:r>
+    </w:p>
+    <w:p>
+      <w:pPr>
+        <w:spacing w:before="0" w:after="120" w:line="360" w:lineRule="auto"/>
+        <w:jc w:val="both"/>
+      </w:pPr>
+      <w:r>
+        <w:rPr>
+          <w:rFonts w:ascii="Times New Roman" w:hAnsi="Times New Roman" w:eastAsia="Times New Roman"/>
+          <w:b/>
+          <w:i w:val="0"/>
+          <w:color w:val="000000"/>
+          <w:sz w:val="24"/>
+        </w:rPr>
+        <w:t xml:space="preserve">Fairness untested. </w:t>
+      </w:r>
+      <w:r>
+        <w:rPr>
+          <w:rFonts w:ascii="Times New Roman" w:hAnsi="Times New Roman" w:eastAsia="Times New Roman"/>
+          <w:b w:val="0"/>
+          <w:i w:val="0"/>
+          <w:color w:val="000000"/>
+          <w:sz w:val="24"/>
+        </w:rPr>
+        <w:t>No race, sex or geography in the data — but that is not protection, since age is used and income can proxy for protected traits. Absence of measured bias is absence of measurement.</w:t>
+      </w:r>
+    </w:p>
+    <w:p>
+      <w:pPr>
+        <w:spacing w:before="0" w:after="120" w:line="360" w:lineRule="auto"/>
+        <w:jc w:val="both"/>
+      </w:pPr>
+      <w:r>
+        <w:rPr>
+          <w:rFonts w:ascii="Times New Roman" w:hAnsi="Times New Roman" w:eastAsia="Times New Roman"/>
+          <w:b/>
+          <w:i w:val="0"/>
+          <w:color w:val="000000"/>
+          <w:sz w:val="24"/>
+        </w:rPr>
+        <w:t xml:space="preserve">Threshold economics. </w:t>
+      </w:r>
+      <w:r>
+        <w:rPr>
+          <w:rFonts w:ascii="Times New Roman" w:hAnsi="Times New Roman" w:eastAsia="Times New Roman"/>
+          <w:b w:val="0"/>
+          <w:i w:val="0"/>
+          <w:color w:val="000000"/>
+          <w:sz w:val="24"/>
+        </w:rPr>
+        <w:t>Maximising F1 weights a missed default and a false alarm equally; real lending does not.</w:t>
+      </w:r>
+    </w:p>
+    <w:p>
+      <w:pPr>
+        <w:spacing w:before="160" w:after="120" w:line="360" w:lineRule="auto"/>
+        <w:jc w:val="left"/>
+      </w:pPr>
+      <w:r>
+        <w:rPr>
+          <w:rFonts w:ascii="Times New Roman" w:hAnsi="Times New Roman" w:eastAsia="Times New Roman"/>
+          <w:b/>
+          <w:i w:val="0"/>
+          <w:color w:val="000000"/>
+          <w:sz w:val="28"/>
+        </w:rPr>
+        <w:t>5.2 Challenges Encountered</w:t>
+      </w:r>
+    </w:p>
+    <w:p>
+      <w:pPr>
+        <w:spacing w:before="0" w:after="120" w:line="360" w:lineRule="auto"/>
+        <w:jc w:val="both"/>
+      </w:pPr>
+      <w:r>
+        <w:rPr>
+          <w:rFonts w:ascii="Times New Roman" w:hAnsi="Times New Roman" w:eastAsia="Times New Roman"/>
+          <w:b/>
+          <w:i w:val="0"/>
+          <w:color w:val="000000"/>
+          <w:sz w:val="24"/>
+        </w:rPr>
+        <w:t xml:space="preserve">Undocumented codes. </w:t>
+      </w:r>
+      <w:r>
+        <w:rPr>
+          <w:rFonts w:ascii="Times New Roman" w:hAnsi="Times New Roman" w:eastAsia="Times New Roman"/>
+          <w:b w:val="0"/>
+          <w:i w:val="0"/>
+          <w:color w:val="000000"/>
+          <w:sz w:val="24"/>
+        </w:rPr>
+        <w:t>The codes 96 and 98 appear in 269 records with no explanation. Those rows are 54.65% positive against a 6.68% base rate, so imputing them away would discard signal while asserting clean payment histories. Imputing with a retained indicator lets the model learn the value was unavailable without guessing what the codes mean.</w:t>
+      </w:r>
+    </w:p>
+    <w:p>
+      <w:pPr>
+        <w:spacing w:before="0" w:after="120" w:line="360" w:lineRule="auto"/>
+        <w:jc w:val="both"/>
+      </w:pPr>
+      <w:r>
+        <w:rPr>
+          <w:rFonts w:ascii="Times New Roman" w:hAnsi="Times New Roman" w:eastAsia="Times New Roman"/>
+          <w:b/>
+          <w:i w:val="0"/>
+          <w:color w:val="000000"/>
+          <w:sz w:val="24"/>
+        </w:rPr>
+        <w:t xml:space="preserve">Deployment and skew. </w:t>
+      </w:r>
+      <w:r>
+        <w:rPr>
+          <w:rFonts w:ascii="Times New Roman" w:hAnsi="Times New Roman" w:eastAsia="Times New Roman"/>
+          <w:b w:val="0"/>
+          <w:i w:val="0"/>
+          <w:color w:val="000000"/>
+          <w:sz w:val="24"/>
+        </w:rPr>
+        <w:t>The Python stack plus a 70 MB model is ~315 MB, so runtime and training dependencies were split to fit the 500 MB limit. Any train/inference preprocessing difference would corrupt predictions silently — one saved pipeline removes the possibility.</w:t>
       </w:r>
     </w:p>
     <w:p>
@@ -9688,8 +9132,6 @@
         <w:trPr>
           <w:cantSplit/>
           <w:tblHeader/>
-          <w:cantSplit/>
-          <w:tblHeader/>
         </w:trPr>
         <w:tc>
           <w:tcPr>
@@ -9698,7 +9140,6 @@
           </w:tcPr>
           <w:p>
             <w:pPr>
-              <w:keepNext/>
               <w:spacing w:line="240" w:lineRule="auto" w:after="40"/>
               <w:jc w:val="center"/>
             </w:pPr>
@@ -9722,7 +9163,6 @@
           </w:tcPr>
           <w:p>
             <w:pPr>
-              <w:keepNext/>
               <w:spacing w:line="240" w:lineRule="auto" w:after="40"/>
               <w:jc w:val="center"/>
             </w:pPr>
@@ -9750,7 +9190,6 @@
           </w:tcPr>
           <w:p>
             <w:pPr>
-              <w:keepNext/>
               <w:spacing w:line="240" w:lineRule="auto" w:after="40"/>
               <w:jc w:val="left"/>
             </w:pPr>
@@ -9773,7 +9212,6 @@
           </w:tcPr>
           <w:p>
             <w:pPr>
-              <w:keepNext/>
               <w:spacing w:line="240" w:lineRule="auto" w:after="40"/>
               <w:jc w:val="center"/>
             </w:pPr>
@@ -9801,7 +9239,6 @@
           </w:tcPr>
           <w:p>
             <w:pPr>
-              <w:keepNext/>
               <w:spacing w:line="240" w:lineRule="auto" w:after="40"/>
               <w:jc w:val="left"/>
             </w:pPr>
@@ -9824,7 +9261,6 @@
           </w:tcPr>
           <w:p>
             <w:pPr>
-              <w:keepNext/>
               <w:spacing w:line="240" w:lineRule="auto" w:after="40"/>
               <w:jc w:val="center"/>
             </w:pPr>
@@ -9852,7 +9288,6 @@
           </w:tcPr>
           <w:p>
             <w:pPr>
-              <w:keepNext/>
               <w:spacing w:line="240" w:lineRule="auto" w:after="40"/>
               <w:jc w:val="left"/>
             </w:pPr>
@@ -9875,7 +9310,6 @@
           </w:tcPr>
           <w:p>
             <w:pPr>
-              <w:keepNext/>
               <w:spacing w:line="240" w:lineRule="auto" w:after="40"/>
               <w:jc w:val="center"/>
             </w:pPr>
@@ -9903,7 +9337,6 @@
           </w:tcPr>
           <w:p>
             <w:pPr>
-              <w:keepNext/>
               <w:spacing w:line="240" w:lineRule="auto" w:after="40"/>
               <w:jc w:val="left"/>
             </w:pPr>
@@ -9926,7 +9359,6 @@
           </w:tcPr>
           <w:p>
             <w:pPr>
-              <w:keepNext/>
               <w:spacing w:line="240" w:lineRule="auto" w:after="40"/>
               <w:jc w:val="center"/>
             </w:pPr>
@@ -9954,7 +9386,6 @@
           </w:tcPr>
           <w:p>
             <w:pPr>
-              <w:keepNext/>
               <w:spacing w:line="240" w:lineRule="auto" w:after="40"/>
               <w:jc w:val="left"/>
             </w:pPr>
@@ -9977,7 +9408,6 @@
           </w:tcPr>
           <w:p>
             <w:pPr>
-              <w:keepNext/>
               <w:spacing w:line="240" w:lineRule="auto" w:after="40"/>
               <w:jc w:val="center"/>
             </w:pPr>
@@ -10047,226 +9477,6 @@
     </w:tbl>
     <w:p>
       <w:pPr>
-        <w:spacing w:before="0" w:after="80" w:line="360" w:lineRule="auto"/>
-        <w:jc w:val="both"/>
-      </w:pPr>
-    </w:p>
-    <w:p>
-      <w:pPr>
-        <w:spacing w:before="160" w:after="120" w:line="360" w:lineRule="auto"/>
-        <w:jc w:val="left"/>
-      </w:pPr>
-      <w:r>
-        <w:rPr>
-          <w:rFonts w:ascii="Times New Roman" w:hAnsi="Times New Roman" w:eastAsia="Times New Roman"/>
-          <w:b/>
-          <w:i w:val="0"/>
-          <w:color w:val="000000"/>
-          <w:sz w:val="28"/>
-        </w:rPr>
-        <w:t>5.1 Key Limitations</w:t>
-      </w:r>
-    </w:p>
-    <w:p>
-      <w:pPr>
-        <w:spacing w:before="0" w:after="120" w:line="360" w:lineRule="auto"/>
-        <w:jc w:val="both"/>
-      </w:pPr>
-      <w:r>
-        <w:rPr>
-          <w:rFonts w:ascii="Times New Roman" w:hAnsi="Times New Roman" w:eastAsia="Times New Roman"/>
-          <w:b/>
-          <w:i w:val="0"/>
-          <w:color w:val="000000"/>
-          <w:sz w:val="24"/>
-        </w:rPr>
-        <w:t xml:space="preserve">Data, not algorithm. </w:t>
-      </w:r>
-      <w:r>
-        <w:rPr>
-          <w:rFonts w:ascii="Times New Roman" w:hAnsi="Times New Roman" w:eastAsia="Times New Roman"/>
-          <w:b w:val="0"/>
-          <w:i w:val="0"/>
-          <w:color w:val="000000"/>
-          <w:sz w:val="24"/>
-        </w:rPr>
-        <w:t>The records are US consumers around 2011 with no date column, so no out-of-time validation is possible and the sampling frame is undocumented.</w:t>
-      </w:r>
-    </w:p>
-    <w:p>
-      <w:pPr>
-        <w:spacing w:before="0" w:after="120" w:line="360" w:lineRule="auto"/>
-        <w:jc w:val="both"/>
-      </w:pPr>
-      <w:r>
-        <w:rPr>
-          <w:rFonts w:ascii="Times New Roman" w:hAnsi="Times New Roman" w:eastAsia="Times New Roman"/>
-          <w:b/>
-          <w:i w:val="0"/>
-          <w:color w:val="000000"/>
-          <w:sz w:val="24"/>
-        </w:rPr>
-        <w:t xml:space="preserve">Uncalibrated. </w:t>
-      </w:r>
-      <w:r>
-        <w:rPr>
-          <w:rFonts w:ascii="Times New Roman" w:hAnsi="Times New Roman" w:eastAsia="Times New Roman"/>
-          <w:b w:val="0"/>
-          <w:i w:val="0"/>
-          <w:color w:val="000000"/>
-          <w:sz w:val="24"/>
-        </w:rPr>
-        <w:t>A predicted 0.30 is a ranking score, not a claim that 30 in 100 such borrowers default.</w:t>
-      </w:r>
-    </w:p>
-    <w:p>
-      <w:pPr>
-        <w:spacing w:before="0" w:after="120" w:line="360" w:lineRule="auto"/>
-        <w:jc w:val="both"/>
-      </w:pPr>
-      <w:r>
-        <w:rPr>
-          <w:rFonts w:ascii="Times New Roman" w:hAnsi="Times New Roman" w:eastAsia="Times New Roman"/>
-          <w:b/>
-          <w:i w:val="0"/>
-          <w:color w:val="000000"/>
-          <w:sz w:val="24"/>
-        </w:rPr>
-        <w:t xml:space="preserve">Fairness untested. </w:t>
-      </w:r>
-      <w:r>
-        <w:rPr>
-          <w:rFonts w:ascii="Times New Roman" w:hAnsi="Times New Roman" w:eastAsia="Times New Roman"/>
-          <w:b w:val="0"/>
-          <w:i w:val="0"/>
-          <w:color w:val="000000"/>
-          <w:sz w:val="24"/>
-        </w:rPr>
-        <w:t>No race, sex or geography in the data. That is not protection — age is used, and income or utilisation can proxy for protected traits. Absence of measured bias is absence of measurement.</w:t>
-      </w:r>
-    </w:p>
-    <w:p>
-      <w:pPr>
-        <w:spacing w:before="0" w:after="120" w:line="360" w:lineRule="auto"/>
-        <w:jc w:val="both"/>
-      </w:pPr>
-      <w:r>
-        <w:rPr>
-          <w:rFonts w:ascii="Times New Roman" w:hAnsi="Times New Roman" w:eastAsia="Times New Roman"/>
-          <w:b/>
-          <w:i w:val="0"/>
-          <w:color w:val="000000"/>
-          <w:sz w:val="24"/>
-        </w:rPr>
-        <w:t xml:space="preserve">Threshold economics. </w:t>
-      </w:r>
-      <w:r>
-        <w:rPr>
-          <w:rFonts w:ascii="Times New Roman" w:hAnsi="Times New Roman" w:eastAsia="Times New Roman"/>
-          <w:b w:val="0"/>
-          <w:i w:val="0"/>
-          <w:color w:val="000000"/>
-          <w:sz w:val="24"/>
-        </w:rPr>
-        <w:t>Maximising F1 weights a missed default and a false alarm equally. Real lending does not; choosing properly needs loss-given-default and margin figures the dataset lacks.</w:t>
-      </w:r>
-    </w:p>
-    <w:p>
-      <w:pPr>
-        <w:spacing w:before="160" w:after="120" w:line="360" w:lineRule="auto"/>
-        <w:jc w:val="left"/>
-      </w:pPr>
-      <w:r>
-        <w:rPr>
-          <w:rFonts w:ascii="Times New Roman" w:hAnsi="Times New Roman" w:eastAsia="Times New Roman"/>
-          <w:b/>
-          <w:i w:val="0"/>
-          <w:color w:val="000000"/>
-          <w:sz w:val="28"/>
-        </w:rPr>
-        <w:t>5.2 Challenges Encountered</w:t>
-      </w:r>
-    </w:p>
-    <w:p>
-      <w:pPr>
-        <w:spacing w:before="0" w:after="120" w:line="360" w:lineRule="auto"/>
-        <w:jc w:val="both"/>
-      </w:pPr>
-      <w:r>
-        <w:rPr>
-          <w:rFonts w:ascii="Times New Roman" w:hAnsi="Times New Roman" w:eastAsia="Times New Roman"/>
-          <w:b/>
-          <w:i w:val="0"/>
-          <w:color w:val="000000"/>
-          <w:sz w:val="24"/>
-        </w:rPr>
-        <w:t xml:space="preserve">Undocumented codes. </w:t>
-      </w:r>
-      <w:r>
-        <w:rPr>
-          <w:rFonts w:ascii="Times New Roman" w:hAnsi="Times New Roman" w:eastAsia="Times New Roman"/>
-          <w:b w:val="0"/>
-          <w:i w:val="0"/>
-          <w:color w:val="000000"/>
-          <w:sz w:val="24"/>
-        </w:rPr>
-        <w:t>The codes 96 and 98 appear in 269 records with no explanation. Those rows are 54.65% positive against a 6.68% base rate, so imputing them away would discard signal while asserting clean payment histories. Imputing with a retained indicator lets the model learn the value was unavailable, without guessing what the codes mean.</w:t>
-      </w:r>
-    </w:p>
-    <w:p>
-      <w:pPr>
-        <w:spacing w:before="0" w:after="120" w:line="360" w:lineRule="auto"/>
-        <w:jc w:val="both"/>
-      </w:pPr>
-      <w:r>
-        <w:rPr>
-          <w:rFonts w:ascii="Times New Roman" w:hAnsi="Times New Roman" w:eastAsia="Times New Roman"/>
-          <w:b/>
-          <w:i w:val="0"/>
-          <w:color w:val="000000"/>
-          <w:sz w:val="24"/>
-        </w:rPr>
-        <w:t xml:space="preserve">Deployment size. </w:t>
-      </w:r>
-      <w:r>
-        <w:rPr>
-          <w:rFonts w:ascii="Times New Roman" w:hAnsi="Times New Roman" w:eastAsia="Times New Roman"/>
-          <w:b w:val="0"/>
-          <w:i w:val="0"/>
-          <w:color w:val="000000"/>
-          <w:sz w:val="24"/>
-        </w:rPr>
-        <w:t>The scientific Python stack plus a 70 MB model is ~315 MB. Splitting runtime from training dependencies was needed to fit the 500 MB limit.</w:t>
-      </w:r>
-    </w:p>
-    <w:p>
-      <w:pPr>
-        <w:spacing w:before="0" w:after="120" w:line="360" w:lineRule="auto"/>
-        <w:jc w:val="both"/>
-      </w:pPr>
-      <w:r>
-        <w:rPr>
-          <w:rFonts w:ascii="Times New Roman" w:hAnsi="Times New Roman" w:eastAsia="Times New Roman"/>
-          <w:b/>
-          <w:i w:val="0"/>
-          <w:color w:val="000000"/>
-          <w:sz w:val="24"/>
-        </w:rPr>
-        <w:t xml:space="preserve">Train-serve skew. </w:t>
-      </w:r>
-      <w:r>
-        <w:rPr>
-          <w:rFonts w:ascii="Times New Roman" w:hAnsi="Times New Roman" w:eastAsia="Times New Roman"/>
-          <w:b w:val="0"/>
-          <w:i w:val="0"/>
-          <w:color w:val="000000"/>
-          <w:sz w:val="24"/>
-        </w:rPr>
-        <w:t>Any difference between training and inference preprocessing corrupts predictions silently. One saved pipeline removes the possibility.</w:t>
-      </w:r>
-    </w:p>
-    <w:p>
-      <w:pPr>
         <w:pageBreakBefore/>
         <w:spacing w:before="0" w:after="200" w:line="360" w:lineRule="auto"/>
         <w:jc w:val="left"/>
@@ -10285,6 +9495,23 @@
     <w:p>
       <w:pPr>
         <w:spacing w:before="0" w:after="120" w:line="360" w:lineRule="auto"/>
+        <w:jc w:val="both"/>
+      </w:pPr>
+      <w:r>
+        <w:rPr>
+          <w:rFonts w:ascii="Times New Roman" w:hAnsi="Times New Roman" w:eastAsia="Times New Roman"/>
+          <w:b w:val="0"/>
+          <w:i w:val="0"/>
+          <w:color w:val="000000"/>
+          <w:sz w:val="24"/>
+        </w:rPr>
+        <w:t>Each item below follows directly from a limitation in Chapter 5.</w:t>
+      </w:r>
+    </w:p>
+    <w:p>
+      <w:pPr>
+        <w:pStyle w:val="ListBullet"/>
+        <w:spacing w:before="0" w:after="60" w:line="360" w:lineRule="auto"/>
         <w:jc w:val="both"/>
       </w:pPr>
       <w:r>
@@ -10310,7 +9537,8 @@
     </w:p>
     <w:p>
       <w:pPr>
-        <w:spacing w:before="0" w:after="120" w:line="360" w:lineRule="auto"/>
+        <w:pStyle w:val="ListBullet"/>
+        <w:spacing w:before="0" w:after="60" w:line="360" w:lineRule="auto"/>
         <w:jc w:val="both"/>
       </w:pPr>
       <w:r>
@@ -10336,7 +9564,8 @@
     </w:p>
     <w:p>
       <w:pPr>
-        <w:spacing w:before="0" w:after="120" w:line="360" w:lineRule="auto"/>
+        <w:pStyle w:val="ListBullet"/>
+        <w:spacing w:before="0" w:after="60" w:line="360" w:lineRule="auto"/>
         <w:jc w:val="both"/>
       </w:pPr>
       <w:r>
@@ -10357,12 +9586,13 @@
           <w:color w:val="000000"/>
           <w:sz w:val="24"/>
         </w:rPr>
-        <w:t>With origination dates, train on an earlier period and test on a later one — the standard approach for credit models, precisely because random splits flatter them.</w:t>
+        <w:t>With origination dates, train on an earlier period and test on a later one — standard for credit models, precisely because random splits flatter them.</w:t>
       </w:r>
     </w:p>
     <w:p>
       <w:pPr>
-        <w:spacing w:before="0" w:after="120" w:line="360" w:lineRule="auto"/>
+        <w:pStyle w:val="ListBullet"/>
+        <w:spacing w:before="0" w:after="60" w:line="360" w:lineRule="auto"/>
         <w:jc w:val="both"/>
       </w:pPr>
       <w:r>
@@ -10383,12 +9613,13 @@
           <w:color w:val="000000"/>
           <w:sz w:val="24"/>
         </w:rPr>
-        <w:t>Permutation importance on held-out data is less biased than the impurity measure used here. Per-prediction attributions (e.g. SHAP) would support the adverse-action explanations regulated lending requires.</w:t>
+        <w:t>Permutation importance on held-out data is less biased than the impurity measure used here; per-prediction attributions such as SHAP would support the adverse-action explanations regulated lending requires.</w:t>
       </w:r>
     </w:p>
     <w:p>
       <w:pPr>
-        <w:spacing w:before="0" w:after="120" w:line="360" w:lineRule="auto"/>
+        <w:pStyle w:val="ListBullet"/>
+        <w:spacing w:before="0" w:after="60" w:line="360" w:lineRule="auto"/>
         <w:jc w:val="both"/>
       </w:pPr>
       <w:r>
@@ -10508,7 +9739,7 @@
           <w:color w:val="000000"/>
           <w:sz w:val="24"/>
         </w:rPr>
-        <w:t>Class weighting, the conventional remedy, moved the model along the precision-recall curve without lifting it; an explicit threshold selected on validation was used instead.</w:t>
+        <w:t>Class weighting moved the model along the precision-recall curve without lifting it; an explicit threshold chosen on validation was used instead.</w:t>
       </w:r>
     </w:p>
     <w:p>
@@ -10542,7 +9773,7 @@
           <w:color w:val="000000"/>
           <w:sz w:val="24"/>
         </w:rPr>
-        <w:t>The residual gap between in-sample and held-out performance was measured and reported, not omitted.</w:t>
+        <w:t>The gap between in-sample and held-out performance was measured and reported, not omitted.</w:t>
       </w:r>
     </w:p>
     <w:p>
@@ -10558,7 +9789,7 @@
           <w:color w:val="000000"/>
           <w:sz w:val="24"/>
         </w:rPr>
-        <w:t>The engineering discipline is what makes the figures trustworthy: preprocessing held inside the saved pipeline so training and inference cannot diverge, the threshold stored with the model so the served cut-off and reported metrics agree, and every documented number generated from the artifact rather than transcribed.</w:t>
+        <w:t>The engineering discipline is what makes the figures trustworthy: preprocessing held inside the saved pipeline so training and inference cannot diverge, the threshold stored with the model, and every documented number generated from the artifact rather than transcribed.</w:t>
       </w:r>
     </w:p>
     <w:p>
@@ -11003,12 +10234,6 @@
     </w:tbl>
     <w:p>
       <w:pPr>
-        <w:spacing w:before="0" w:after="80" w:line="360" w:lineRule="auto"/>
-        <w:jc w:val="both"/>
-      </w:pPr>
-    </w:p>
-    <w:p>
-      <w:pPr>
         <w:spacing w:before="0" w:after="120" w:line="360" w:lineRule="auto"/>
         <w:jc w:val="both"/>
       </w:pPr>
@@ -11584,7 +10809,7 @@
     <w:qFormat/>
     <w:rsid w:val="00FC693F"/>
     <w:pPr>
-      <w:spacing w:line="360" w:lineRule="auto" w:after="120"/>
+      <w:spacing w:line="360" w:lineRule="auto" w:after="80"/>
       <w:jc w:val="both"/>
     </w:pPr>
     <w:rPr>

</xml_diff>